<commit_message>
feat: complete client filing workflow
</commit_message>
<xml_diff>
--- a/backend/resources/application_templates/trademark_application_blank.docx
+++ b/backend/resources/application_templates/trademark_application_blank.docx
@@ -1,6 +1,6 @@
 
 <file path=word/document.xml><?xml version="1.0" encoding="utf-8"?>
-<w:document xmlns:wpc="http://schemas.microsoft.com/office/word/2010/wordprocessingCanvas" xmlns:cx="http://schemas.microsoft.com/office/drawing/2014/chartex" xmlns:cx1="http://schemas.microsoft.com/office/drawing/2015/9/8/chartex" xmlns:cx2="http://schemas.microsoft.com/office/drawing/2015/10/21/chartex" xmlns:cx3="http://schemas.microsoft.com/office/drawing/2016/5/9/chartex" xmlns:cx4="http://schemas.microsoft.com/office/drawing/2016/5/10/chartex" xmlns:cx5="http://schemas.microsoft.com/office/drawing/2016/5/11/chartex" xmlns:cx6="http://schemas.microsoft.com/office/drawing/2016/5/12/chartex" xmlns:cx7="http://schemas.microsoft.com/office/drawing/2016/5/13/chartex" xmlns:cx8="http://schemas.microsoft.com/office/drawing/2016/5/14/chartex" xmlns:mc="http://schemas.openxmlformats.org/markup-compatibility/2006" xmlns:aink="http://schemas.microsoft.com/office/drawing/2016/ink" xmlns:am3d="http://schemas.microsoft.com/office/drawing/2017/model3d" xmlns:o="urn:schemas-microsoft-com:office:office" xmlns:oel="http://schemas.microsoft.com/office/2019/extlst" xmlns:r="http://schemas.openxmlformats.org/officeDocument/2006/relationships" xmlns:m="http://schemas.openxmlformats.org/officeDocument/2006/math" xmlns:v="urn:schemas-microsoft-com:vml" xmlns:wp14="http://schemas.microsoft.com/office/word/2010/wordprocessingDrawing" xmlns:wp="http://schemas.openxmlformats.org/drawingml/2006/wordprocessingDrawing" xmlns:w10="urn:schemas-microsoft-com:office:word" xmlns:w="http://schemas.openxmlformats.org/wordprocessingml/2006/main" xmlns:w14="http://schemas.microsoft.com/office/word/2010/wordml" xmlns:w15="http://schemas.microsoft.com/office/word/2012/wordml" xmlns:w16cex="http://schemas.microsoft.com/office/word/2018/wordml/cex" xmlns:w16cid="http://schemas.microsoft.com/office/word/2016/wordml/cid" xmlns:w16="http://schemas.microsoft.com/office/word/2018/wordml" xmlns:w16sdtdh="http://schemas.microsoft.com/office/word/2020/wordml/sdtdatahash" xmlns:w16se="http://schemas.microsoft.com/office/word/2015/wordml/symex" xmlns:wpg="http://schemas.microsoft.com/office/word/2010/wordprocessingGroup" xmlns:wpi="http://schemas.microsoft.com/office/word/2010/wordprocessingInk" xmlns:wne="http://schemas.microsoft.com/office/word/2006/wordml" xmlns:wps="http://schemas.microsoft.com/office/word/2010/wordprocessingShape" mc:Ignorable="w14 w15 w16se w16cid w16 w16cex w16sdtdh wp14">
+<w:document xmlns:wpc="http://schemas.microsoft.com/office/word/2010/wordprocessingCanvas" xmlns:cx="http://schemas.microsoft.com/office/drawing/2014/chartex" xmlns:cx1="http://schemas.microsoft.com/office/drawing/2015/9/8/chartex" xmlns:cx2="http://schemas.microsoft.com/office/drawing/2015/10/21/chartex" xmlns:cx3="http://schemas.microsoft.com/office/drawing/2016/5/9/chartex" xmlns:cx4="http://schemas.microsoft.com/office/drawing/2016/5/10/chartex" xmlns:cx5="http://schemas.microsoft.com/office/drawing/2016/5/11/chartex" xmlns:cx6="http://schemas.microsoft.com/office/drawing/2016/5/12/chartex" xmlns:cx7="http://schemas.microsoft.com/office/drawing/2016/5/13/chartex" xmlns:cx8="http://schemas.microsoft.com/office/drawing/2016/5/14/chartex" xmlns:mc="http://schemas.openxmlformats.org/markup-compatibility/2006" xmlns:aink="http://schemas.microsoft.com/office/drawing/2016/ink" xmlns:am3d="http://schemas.microsoft.com/office/drawing/2017/model3d" xmlns:o="urn:schemas-microsoft-com:office:office" xmlns:oel="http://schemas.microsoft.com/office/2019/extlst" xmlns:r="http://schemas.openxmlformats.org/officeDocument/2006/relationships" xmlns:m="http://schemas.openxmlformats.org/officeDocument/2006/math" xmlns:v="urn:schemas-microsoft-com:vml" xmlns:wp14="http://schemas.microsoft.com/office/word/2010/wordprocessingDrawing" xmlns:wp="http://schemas.openxmlformats.org/drawingml/2006/wordprocessingDrawing" xmlns:w10="urn:schemas-microsoft-com:office:word" xmlns:w="http://schemas.openxmlformats.org/wordprocessingml/2006/main" xmlns:w14="http://schemas.microsoft.com/office/word/2010/wordml" xmlns:w15="http://schemas.microsoft.com/office/word/2012/wordml" xmlns:w16cex="http://schemas.microsoft.com/office/word/2018/wordml/cex" xmlns:w16cid="http://schemas.microsoft.com/office/word/2016/wordml/cid" xmlns:w16="http://schemas.microsoft.com/office/word/2018/wordml" xmlns:w16du="http://schemas.microsoft.com/office/word/2023/wordml/word16du" xmlns:w16sdtdh="http://schemas.microsoft.com/office/word/2020/wordml/sdtdatahash" xmlns:w16sdtfl="http://schemas.microsoft.com/office/word/2024/wordml/sdtformatlock" xmlns:w16se="http://schemas.microsoft.com/office/word/2015/wordml/symex" xmlns:wpg="http://schemas.microsoft.com/office/word/2010/wordprocessingGroup" xmlns:wpi="http://schemas.microsoft.com/office/word/2010/wordprocessingInk" xmlns:wne="http://schemas.microsoft.com/office/word/2006/wordml" xmlns:wps="http://schemas.microsoft.com/office/word/2010/wordprocessingShape" mc:Ignorable="w14 w15 w16se w16cid w16 w16cex w16sdtdh w16sdtfl w16du wp14">
   <w:body>
     <w:p>
       <w:pPr>
@@ -134,12 +134,6 @@
         <w:gridCol w:w="1436"/>
       </w:tblGrid>
       <w:tr>
-        <w:tblPrEx>
-          <w:tblCellMar>
-            <w:top w:w="0" w:type="dxa"/>
-            <w:bottom w:w="0" w:type="dxa"/>
-          </w:tblCellMar>
-        </w:tblPrEx>
         <w:trPr>
           <w:trHeight w:val="772"/>
         </w:trPr>
@@ -209,12 +203,6 @@
         </w:tc>
       </w:tr>
       <w:tr>
-        <w:tblPrEx>
-          <w:tblCellMar>
-            <w:top w:w="0" w:type="dxa"/>
-            <w:bottom w:w="0" w:type="dxa"/>
-          </w:tblCellMar>
-        </w:tblPrEx>
         <w:trPr>
           <w:trHeight w:val="397"/>
         </w:trPr>
@@ -386,12 +374,6 @@
         </w:tc>
       </w:tr>
       <w:tr>
-        <w:tblPrEx>
-          <w:tblCellMar>
-            <w:top w:w="0" w:type="dxa"/>
-            <w:bottom w:w="0" w:type="dxa"/>
-          </w:tblCellMar>
-        </w:tblPrEx>
         <w:trPr>
           <w:trHeight w:val="480"/>
         </w:trPr>
@@ -460,12 +442,6 @@
         </w:tc>
       </w:tr>
       <w:tr>
-        <w:tblPrEx>
-          <w:tblCellMar>
-            <w:top w:w="0" w:type="dxa"/>
-            <w:bottom w:w="0" w:type="dxa"/>
-          </w:tblCellMar>
-        </w:tblPrEx>
         <w:tc>
           <w:tcPr>
             <w:tcW w:w="6120" w:type="dxa"/>
@@ -820,12 +796,6 @@
         </w:tc>
       </w:tr>
       <w:tr>
-        <w:tblPrEx>
-          <w:tblCellMar>
-            <w:top w:w="0" w:type="dxa"/>
-            <w:bottom w:w="0" w:type="dxa"/>
-          </w:tblCellMar>
-        </w:tblPrEx>
         <w:tc>
           <w:tcPr>
             <w:tcW w:w="6120" w:type="dxa"/>
@@ -1009,12 +979,6 @@
         </w:tc>
       </w:tr>
       <w:tr>
-        <w:tblPrEx>
-          <w:tblCellMar>
-            <w:top w:w="0" w:type="dxa"/>
-            <w:bottom w:w="0" w:type="dxa"/>
-          </w:tblCellMar>
-        </w:tblPrEx>
         <w:trPr>
           <w:trHeight w:val="1480"/>
         </w:trPr>
@@ -1519,12 +1483,6 @@
         </w:tc>
       </w:tr>
       <w:tr>
-        <w:tblPrEx>
-          <w:tblCellMar>
-            <w:top w:w="0" w:type="dxa"/>
-            <w:bottom w:w="0" w:type="dxa"/>
-          </w:tblCellMar>
-        </w:tblPrEx>
         <w:tc>
           <w:tcPr>
             <w:tcW w:w="2183" w:type="dxa"/>
@@ -1662,12 +1620,6 @@
         </w:tc>
       </w:tr>
       <w:tr>
-        <w:tblPrEx>
-          <w:tblCellMar>
-            <w:top w:w="0" w:type="dxa"/>
-            <w:bottom w:w="0" w:type="dxa"/>
-          </w:tblCellMar>
-        </w:tblPrEx>
         <w:trPr>
           <w:trHeight w:val="499"/>
         </w:trPr>
@@ -1749,12 +1701,6 @@
         </w:tc>
       </w:tr>
       <w:tr>
-        <w:tblPrEx>
-          <w:tblCellMar>
-            <w:top w:w="0" w:type="dxa"/>
-            <w:bottom w:w="0" w:type="dxa"/>
-          </w:tblCellMar>
-        </w:tblPrEx>
         <w:tc>
           <w:tcPr>
             <w:tcW w:w="6551" w:type="dxa"/>
@@ -1932,12 +1878,6 @@
         </w:tc>
       </w:tr>
       <w:tr>
-        <w:tblPrEx>
-          <w:tblCellMar>
-            <w:top w:w="0" w:type="dxa"/>
-            <w:bottom w:w="0" w:type="dxa"/>
-          </w:tblCellMar>
-        </w:tblPrEx>
         <w:tc>
           <w:tcPr>
             <w:tcW w:w="6551" w:type="dxa"/>
@@ -2014,12 +1954,6 @@
         </w:tc>
       </w:tr>
       <w:tr>
-        <w:tblPrEx>
-          <w:tblCellMar>
-            <w:top w:w="0" w:type="dxa"/>
-            <w:bottom w:w="0" w:type="dxa"/>
-          </w:tblCellMar>
-        </w:tblPrEx>
         <w:tc>
           <w:tcPr>
             <w:tcW w:w="6551" w:type="dxa"/>
@@ -2064,12 +1998,6 @@
         </w:tc>
       </w:tr>
       <w:tr>
-        <w:tblPrEx>
-          <w:tblCellMar>
-            <w:top w:w="0" w:type="dxa"/>
-            <w:bottom w:w="0" w:type="dxa"/>
-          </w:tblCellMar>
-        </w:tblPrEx>
         <w:tc>
           <w:tcPr>
             <w:tcW w:w="6551" w:type="dxa"/>
@@ -2149,12 +2077,6 @@
         </w:tc>
       </w:tr>
       <w:tr>
-        <w:tblPrEx>
-          <w:tblCellMar>
-            <w:top w:w="0" w:type="dxa"/>
-            <w:bottom w:w="0" w:type="dxa"/>
-          </w:tblCellMar>
-        </w:tblPrEx>
         <w:trPr>
           <w:trHeight w:val="1280"/>
         </w:trPr>
@@ -2199,12 +2121,6 @@
         </w:tc>
       </w:tr>
       <w:tr>
-        <w:tblPrEx>
-          <w:tblCellMar>
-            <w:top w:w="0" w:type="dxa"/>
-            <w:bottom w:w="0" w:type="dxa"/>
-          </w:tblCellMar>
-        </w:tblPrEx>
         <w:trPr>
           <w:trHeight w:val="1098"/>
         </w:trPr>
@@ -2300,12 +2216,6 @@
         </w:tc>
       </w:tr>
       <w:tr>
-        <w:tblPrEx>
-          <w:tblCellMar>
-            <w:top w:w="0" w:type="dxa"/>
-            <w:bottom w:w="0" w:type="dxa"/>
-          </w:tblCellMar>
-        </w:tblPrEx>
         <w:trPr>
           <w:trHeight w:val="480"/>
         </w:trPr>
@@ -2363,12 +2273,6 @@
         </w:tc>
       </w:tr>
       <w:tr>
-        <w:tblPrEx>
-          <w:tblCellMar>
-            <w:top w:w="0" w:type="dxa"/>
-            <w:bottom w:w="0" w:type="dxa"/>
-          </w:tblCellMar>
-        </w:tblPrEx>
         <w:tc>
           <w:tcPr>
             <w:tcW w:w="6551" w:type="dxa"/>
@@ -2464,12 +2368,6 @@
         </w:tc>
       </w:tr>
       <w:tr>
-        <w:tblPrEx>
-          <w:tblCellMar>
-            <w:top w:w="0" w:type="dxa"/>
-            <w:bottom w:w="0" w:type="dxa"/>
-          </w:tblCellMar>
-        </w:tblPrEx>
         <w:tc>
           <w:tcPr>
             <w:tcW w:w="10264" w:type="dxa"/>
@@ -2494,12 +2392,6 @@
         </w:tc>
       </w:tr>
       <w:tr>
-        <w:tblPrEx>
-          <w:tblCellMar>
-            <w:top w:w="0" w:type="dxa"/>
-            <w:bottom w:w="0" w:type="dxa"/>
-          </w:tblCellMar>
-        </w:tblPrEx>
         <w:tc>
           <w:tcPr>
             <w:tcW w:w="108" w:type="dxa"/>
@@ -2606,12 +2498,6 @@
         </w:tc>
       </w:tr>
       <w:tr>
-        <w:tblPrEx>
-          <w:tblCellMar>
-            <w:top w:w="0" w:type="dxa"/>
-            <w:bottom w:w="0" w:type="dxa"/>
-          </w:tblCellMar>
-        </w:tblPrEx>
         <w:tc>
           <w:tcPr>
             <w:tcW w:w="10264" w:type="dxa"/>
@@ -2635,12 +2521,6 @@
         </w:tc>
       </w:tr>
       <w:tr>
-        <w:tblPrEx>
-          <w:tblCellMar>
-            <w:top w:w="0" w:type="dxa"/>
-            <w:bottom w:w="0" w:type="dxa"/>
-          </w:tblCellMar>
-        </w:tblPrEx>
         <w:trPr>
           <w:trHeight w:val="3856"/>
         </w:trPr>
@@ -2708,12 +2588,6 @@
         </w:tc>
       </w:tr>
       <w:tr>
-        <w:tblPrEx>
-          <w:tblCellMar>
-            <w:top w:w="0" w:type="dxa"/>
-            <w:bottom w:w="0" w:type="dxa"/>
-          </w:tblCellMar>
-        </w:tblPrEx>
         <w:tc>
           <w:tcPr>
             <w:tcW w:w="10264" w:type="dxa"/>
@@ -2736,12 +2610,6 @@
         </w:tc>
       </w:tr>
       <w:tr>
-        <w:tblPrEx>
-          <w:tblCellMar>
-            <w:top w:w="0" w:type="dxa"/>
-            <w:bottom w:w="0" w:type="dxa"/>
-          </w:tblCellMar>
-        </w:tblPrEx>
         <w:tc>
           <w:tcPr>
             <w:tcW w:w="108" w:type="dxa"/>
@@ -2800,12 +2668,6 @@
         </w:tc>
       </w:tr>
       <w:tr>
-        <w:tblPrEx>
-          <w:tblCellMar>
-            <w:top w:w="0" w:type="dxa"/>
-            <w:bottom w:w="0" w:type="dxa"/>
-          </w:tblCellMar>
-        </w:tblPrEx>
         <w:tc>
           <w:tcPr>
             <w:tcW w:w="10264" w:type="dxa"/>
@@ -2829,12 +2691,6 @@
         </w:tc>
       </w:tr>
       <w:tr>
-        <w:tblPrEx>
-          <w:tblCellMar>
-            <w:top w:w="0" w:type="dxa"/>
-            <w:bottom w:w="0" w:type="dxa"/>
-          </w:tblCellMar>
-        </w:tblPrEx>
         <w:tc>
           <w:tcPr>
             <w:tcW w:w="108" w:type="dxa"/>
@@ -2911,12 +2767,6 @@
         </w:tc>
       </w:tr>
       <w:tr>
-        <w:tblPrEx>
-          <w:tblCellMar>
-            <w:top w:w="0" w:type="dxa"/>
-            <w:bottom w:w="0" w:type="dxa"/>
-          </w:tblCellMar>
-        </w:tblPrEx>
         <w:tc>
           <w:tcPr>
             <w:tcW w:w="10264" w:type="dxa"/>
@@ -2936,12 +2786,6 @@
         </w:tc>
       </w:tr>
       <w:tr>
-        <w:tblPrEx>
-          <w:tblCellMar>
-            <w:top w:w="0" w:type="dxa"/>
-            <w:bottom w:w="0" w:type="dxa"/>
-          </w:tblCellMar>
-        </w:tblPrEx>
         <w:tc>
           <w:tcPr>
             <w:tcW w:w="10264" w:type="dxa"/>
@@ -2965,12 +2809,6 @@
         </w:tc>
       </w:tr>
       <w:tr>
-        <w:tblPrEx>
-          <w:tblCellMar>
-            <w:top w:w="0" w:type="dxa"/>
-            <w:bottom w:w="0" w:type="dxa"/>
-          </w:tblCellMar>
-        </w:tblPrEx>
         <w:tc>
           <w:tcPr>
             <w:tcW w:w="108" w:type="dxa"/>
@@ -3194,12 +3032,6 @@
         </w:tc>
       </w:tr>
       <w:tr>
-        <w:tblPrEx>
-          <w:tblCellMar>
-            <w:top w:w="0" w:type="dxa"/>
-            <w:bottom w:w="0" w:type="dxa"/>
-          </w:tblCellMar>
-        </w:tblPrEx>
         <w:tc>
           <w:tcPr>
             <w:tcW w:w="10264" w:type="dxa"/>
@@ -3223,12 +3055,6 @@
         </w:tc>
       </w:tr>
       <w:tr>
-        <w:tblPrEx>
-          <w:tblCellMar>
-            <w:top w:w="0" w:type="dxa"/>
-            <w:bottom w:w="0" w:type="dxa"/>
-          </w:tblCellMar>
-        </w:tblPrEx>
         <w:tc>
           <w:tcPr>
             <w:tcW w:w="108" w:type="dxa"/>
@@ -3403,12 +3229,6 @@
         </w:tc>
       </w:tr>
       <w:tr>
-        <w:tblPrEx>
-          <w:tblCellMar>
-            <w:top w:w="0" w:type="dxa"/>
-            <w:bottom w:w="0" w:type="dxa"/>
-          </w:tblCellMar>
-        </w:tblPrEx>
         <w:tc>
           <w:tcPr>
             <w:tcW w:w="10264" w:type="dxa"/>
@@ -3432,12 +3252,6 @@
         </w:tc>
       </w:tr>
       <w:tr>
-        <w:tblPrEx>
-          <w:tblCellMar>
-            <w:top w:w="0" w:type="dxa"/>
-            <w:bottom w:w="0" w:type="dxa"/>
-          </w:tblCellMar>
-        </w:tblPrEx>
         <w:tc>
           <w:tcPr>
             <w:tcW w:w="108" w:type="dxa"/>
@@ -3651,12 +3465,6 @@
         </w:tc>
       </w:tr>
       <w:tr>
-        <w:tblPrEx>
-          <w:tblCellMar>
-            <w:top w:w="0" w:type="dxa"/>
-            <w:bottom w:w="0" w:type="dxa"/>
-          </w:tblCellMar>
-        </w:tblPrEx>
         <w:tc>
           <w:tcPr>
             <w:tcW w:w="10264" w:type="dxa"/>
@@ -3680,12 +3488,6 @@
         </w:tc>
       </w:tr>
       <w:tr>
-        <w:tblPrEx>
-          <w:tblCellMar>
-            <w:top w:w="0" w:type="dxa"/>
-            <w:bottom w:w="0" w:type="dxa"/>
-          </w:tblCellMar>
-        </w:tblPrEx>
         <w:tc>
           <w:tcPr>
             <w:tcW w:w="108" w:type="dxa"/>
@@ -3741,12 +3543,6 @@
         </w:tc>
       </w:tr>
       <w:tr>
-        <w:tblPrEx>
-          <w:tblCellMar>
-            <w:top w:w="0" w:type="dxa"/>
-            <w:bottom w:w="0" w:type="dxa"/>
-          </w:tblCellMar>
-        </w:tblPrEx>
         <w:tc>
           <w:tcPr>
             <w:tcW w:w="10264" w:type="dxa"/>
@@ -3770,12 +3566,6 @@
         </w:tc>
       </w:tr>
       <w:tr>
-        <w:tblPrEx>
-          <w:tblCellMar>
-            <w:top w:w="0" w:type="dxa"/>
-            <w:bottom w:w="0" w:type="dxa"/>
-          </w:tblCellMar>
-        </w:tblPrEx>
         <w:tc>
           <w:tcPr>
             <w:tcW w:w="108" w:type="dxa"/>
@@ -3831,12 +3621,6 @@
         </w:tc>
       </w:tr>
       <w:tr>
-        <w:tblPrEx>
-          <w:tblCellMar>
-            <w:top w:w="0" w:type="dxa"/>
-            <w:bottom w:w="0" w:type="dxa"/>
-          </w:tblCellMar>
-        </w:tblPrEx>
         <w:tc>
           <w:tcPr>
             <w:tcW w:w="10264" w:type="dxa"/>
@@ -3860,12 +3644,6 @@
         </w:tc>
       </w:tr>
       <w:tr>
-        <w:tblPrEx>
-          <w:tblCellMar>
-            <w:top w:w="0" w:type="dxa"/>
-            <w:bottom w:w="0" w:type="dxa"/>
-          </w:tblCellMar>
-        </w:tblPrEx>
         <w:tc>
           <w:tcPr>
             <w:tcW w:w="108" w:type="dxa"/>
@@ -3921,12 +3699,6 @@
         </w:tc>
       </w:tr>
       <w:tr>
-        <w:tblPrEx>
-          <w:tblCellMar>
-            <w:top w:w="0" w:type="dxa"/>
-            <w:bottom w:w="0" w:type="dxa"/>
-          </w:tblCellMar>
-        </w:tblPrEx>
         <w:tc>
           <w:tcPr>
             <w:tcW w:w="10264" w:type="dxa"/>
@@ -3946,12 +3718,6 @@
         </w:tc>
       </w:tr>
       <w:tr>
-        <w:tblPrEx>
-          <w:tblCellMar>
-            <w:top w:w="0" w:type="dxa"/>
-            <w:bottom w:w="0" w:type="dxa"/>
-          </w:tblCellMar>
-        </w:tblPrEx>
         <w:trPr>
           <w:trHeight w:val="240"/>
         </w:trPr>
@@ -4012,12 +3778,6 @@
         </w:tc>
       </w:tr>
       <w:tr>
-        <w:tblPrEx>
-          <w:tblCellMar>
-            <w:top w:w="0" w:type="dxa"/>
-            <w:bottom w:w="0" w:type="dxa"/>
-          </w:tblCellMar>
-        </w:tblPrEx>
         <w:tc>
           <w:tcPr>
             <w:tcW w:w="108" w:type="dxa"/>
@@ -4123,12 +3883,6 @@
         </w:tc>
       </w:tr>
       <w:tr>
-        <w:tblPrEx>
-          <w:tblCellMar>
-            <w:top w:w="0" w:type="dxa"/>
-            <w:bottom w:w="0" w:type="dxa"/>
-          </w:tblCellMar>
-        </w:tblPrEx>
         <w:trPr>
           <w:trHeight w:val="420"/>
         </w:trPr>
@@ -4151,12 +3905,6 @@
         </w:tc>
       </w:tr>
       <w:tr>
-        <w:tblPrEx>
-          <w:tblCellMar>
-            <w:top w:w="0" w:type="dxa"/>
-            <w:bottom w:w="0" w:type="dxa"/>
-          </w:tblCellMar>
-        </w:tblPrEx>
         <w:tc>
           <w:tcPr>
             <w:tcW w:w="10264" w:type="dxa"/>
@@ -4244,12 +3992,6 @@
         </w:tc>
       </w:tr>
       <w:tr>
-        <w:tblPrEx>
-          <w:tblCellMar>
-            <w:top w:w="0" w:type="dxa"/>
-            <w:bottom w:w="0" w:type="dxa"/>
-          </w:tblCellMar>
-        </w:tblPrEx>
         <w:tc>
           <w:tcPr>
             <w:tcW w:w="10264" w:type="dxa"/>
@@ -4272,12 +4014,6 @@
         </w:tc>
       </w:tr>
       <w:tr>
-        <w:tblPrEx>
-          <w:tblCellMar>
-            <w:top w:w="0" w:type="dxa"/>
-            <w:bottom w:w="0" w:type="dxa"/>
-          </w:tblCellMar>
-        </w:tblPrEx>
         <w:tc>
           <w:tcPr>
             <w:tcW w:w="1712" w:type="dxa"/>
@@ -4320,12 +4056,6 @@
         </w:tc>
       </w:tr>
       <w:tr>
-        <w:tblPrEx>
-          <w:tblCellMar>
-            <w:top w:w="0" w:type="dxa"/>
-            <w:bottom w:w="0" w:type="dxa"/>
-          </w:tblCellMar>
-        </w:tblPrEx>
         <w:tc>
           <w:tcPr>
             <w:tcW w:w="1712" w:type="dxa"/>
@@ -4362,12 +4092,6 @@
         </w:tc>
       </w:tr>
       <w:tr>
-        <w:tblPrEx>
-          <w:tblCellMar>
-            <w:top w:w="0" w:type="dxa"/>
-            <w:bottom w:w="0" w:type="dxa"/>
-          </w:tblCellMar>
-        </w:tblPrEx>
         <w:tc>
           <w:tcPr>
             <w:tcW w:w="1712" w:type="dxa"/>
@@ -4404,12 +4128,6 @@
         </w:tc>
       </w:tr>
       <w:tr>
-        <w:tblPrEx>
-          <w:tblCellMar>
-            <w:top w:w="0" w:type="dxa"/>
-            <w:bottom w:w="0" w:type="dxa"/>
-          </w:tblCellMar>
-        </w:tblPrEx>
         <w:tc>
           <w:tcPr>
             <w:tcW w:w="1712" w:type="dxa"/>
@@ -4446,12 +4164,6 @@
         </w:tc>
       </w:tr>
       <w:tr>
-        <w:tblPrEx>
-          <w:tblCellMar>
-            <w:top w:w="0" w:type="dxa"/>
-            <w:bottom w:w="0" w:type="dxa"/>
-          </w:tblCellMar>
-        </w:tblPrEx>
         <w:tc>
           <w:tcPr>
             <w:tcW w:w="1712" w:type="dxa"/>
@@ -4488,12 +4200,6 @@
         </w:tc>
       </w:tr>
       <w:tr>
-        <w:tblPrEx>
-          <w:tblCellMar>
-            <w:top w:w="0" w:type="dxa"/>
-            <w:bottom w:w="0" w:type="dxa"/>
-          </w:tblCellMar>
-        </w:tblPrEx>
         <w:tc>
           <w:tcPr>
             <w:tcW w:w="1712" w:type="dxa"/>
@@ -4530,12 +4236,6 @@
         </w:tc>
       </w:tr>
       <w:tr>
-        <w:tblPrEx>
-          <w:tblCellMar>
-            <w:top w:w="0" w:type="dxa"/>
-            <w:bottom w:w="0" w:type="dxa"/>
-          </w:tblCellMar>
-        </w:tblPrEx>
         <w:tc>
           <w:tcPr>
             <w:tcW w:w="1712" w:type="dxa"/>
@@ -4572,12 +4272,6 @@
         </w:tc>
       </w:tr>
       <w:tr>
-        <w:tblPrEx>
-          <w:tblCellMar>
-            <w:top w:w="0" w:type="dxa"/>
-            <w:bottom w:w="0" w:type="dxa"/>
-          </w:tblCellMar>
-        </w:tblPrEx>
         <w:tc>
           <w:tcPr>
             <w:tcW w:w="1712" w:type="dxa"/>
@@ -4614,12 +4308,6 @@
         </w:tc>
       </w:tr>
       <w:tr>
-        <w:tblPrEx>
-          <w:tblCellMar>
-            <w:top w:w="0" w:type="dxa"/>
-            <w:bottom w:w="0" w:type="dxa"/>
-          </w:tblCellMar>
-        </w:tblPrEx>
         <w:tc>
           <w:tcPr>
             <w:tcW w:w="1712" w:type="dxa"/>
@@ -4656,12 +4344,6 @@
         </w:tc>
       </w:tr>
       <w:tr>
-        <w:tblPrEx>
-          <w:tblCellMar>
-            <w:top w:w="0" w:type="dxa"/>
-            <w:bottom w:w="0" w:type="dxa"/>
-          </w:tblCellMar>
-        </w:tblPrEx>
         <w:tc>
           <w:tcPr>
             <w:tcW w:w="1712" w:type="dxa"/>
@@ -4698,12 +4380,6 @@
         </w:tc>
       </w:tr>
       <w:tr>
-        <w:tblPrEx>
-          <w:tblCellMar>
-            <w:top w:w="0" w:type="dxa"/>
-            <w:bottom w:w="0" w:type="dxa"/>
-          </w:tblCellMar>
-        </w:tblPrEx>
         <w:tc>
           <w:tcPr>
             <w:tcW w:w="1712" w:type="dxa"/>
@@ -4740,12 +4416,6 @@
         </w:tc>
       </w:tr>
       <w:tr>
-        <w:tblPrEx>
-          <w:tblCellMar>
-            <w:top w:w="0" w:type="dxa"/>
-            <w:bottom w:w="0" w:type="dxa"/>
-          </w:tblCellMar>
-        </w:tblPrEx>
         <w:tc>
           <w:tcPr>
             <w:tcW w:w="10264" w:type="dxa"/>
@@ -4791,10 +4461,6 @@
             <w:left w:val="single" w:sz="12" w:space="0" w:color="auto"/>
             <w:right w:val="single" w:sz="12" w:space="0" w:color="auto"/>
           </w:tblBorders>
-          <w:tblCellMar>
-            <w:top w:w="0" w:type="dxa"/>
-            <w:bottom w:w="0" w:type="dxa"/>
-          </w:tblCellMar>
         </w:tblPrEx>
         <w:tc>
           <w:tcPr>
@@ -4825,12 +4491,6 @@
         </w:tc>
       </w:tr>
       <w:tr>
-        <w:tblPrEx>
-          <w:tblCellMar>
-            <w:top w:w="0" w:type="dxa"/>
-            <w:bottom w:w="0" w:type="dxa"/>
-          </w:tblCellMar>
-        </w:tblPrEx>
         <w:tc>
           <w:tcPr>
             <w:tcW w:w="108" w:type="dxa"/>
@@ -4928,12 +4588,6 @@
         </w:tc>
       </w:tr>
       <w:tr>
-        <w:tblPrEx>
-          <w:tblCellMar>
-            <w:top w:w="0" w:type="dxa"/>
-            <w:bottom w:w="0" w:type="dxa"/>
-          </w:tblCellMar>
-        </w:tblPrEx>
         <w:tc>
           <w:tcPr>
             <w:tcW w:w="10264" w:type="dxa"/>
@@ -5022,12 +4676,6 @@
         </w:tc>
       </w:tr>
       <w:tr>
-        <w:tblPrEx>
-          <w:tblCellMar>
-            <w:top w:w="0" w:type="dxa"/>
-            <w:bottom w:w="0" w:type="dxa"/>
-          </w:tblCellMar>
-        </w:tblPrEx>
         <w:tc>
           <w:tcPr>
             <w:tcW w:w="10264" w:type="dxa"/>
@@ -5049,12 +4697,6 @@
         </w:tc>
       </w:tr>
       <w:tr>
-        <w:tblPrEx>
-          <w:tblCellMar>
-            <w:top w:w="0" w:type="dxa"/>
-            <w:bottom w:w="0" w:type="dxa"/>
-          </w:tblCellMar>
-        </w:tblPrEx>
         <w:tc>
           <w:tcPr>
             <w:tcW w:w="108" w:type="dxa"/>
@@ -5108,12 +4750,6 @@
         </w:tc>
       </w:tr>
       <w:tr>
-        <w:tblPrEx>
-          <w:tblCellMar>
-            <w:top w:w="0" w:type="dxa"/>
-            <w:bottom w:w="0" w:type="dxa"/>
-          </w:tblCellMar>
-        </w:tblPrEx>
         <w:tc>
           <w:tcPr>
             <w:tcW w:w="10264" w:type="dxa"/>
@@ -5137,12 +4773,6 @@
         </w:tc>
       </w:tr>
       <w:tr>
-        <w:tblPrEx>
-          <w:tblCellMar>
-            <w:top w:w="0" w:type="dxa"/>
-            <w:bottom w:w="0" w:type="dxa"/>
-          </w:tblCellMar>
-        </w:tblPrEx>
         <w:tc>
           <w:tcPr>
             <w:tcW w:w="108" w:type="dxa"/>
@@ -5198,12 +4828,6 @@
         </w:tc>
       </w:tr>
       <w:tr>
-        <w:tblPrEx>
-          <w:tblCellMar>
-            <w:top w:w="0" w:type="dxa"/>
-            <w:bottom w:w="0" w:type="dxa"/>
-          </w:tblCellMar>
-        </w:tblPrEx>
         <w:tc>
           <w:tcPr>
             <w:tcW w:w="10264" w:type="dxa"/>
@@ -5229,12 +4853,6 @@
       </w:tr>
       <w:bookmarkEnd w:id="0"/>
       <w:tr>
-        <w:tblPrEx>
-          <w:tblCellMar>
-            <w:top w:w="0" w:type="dxa"/>
-            <w:bottom w:w="0" w:type="dxa"/>
-          </w:tblCellMar>
-        </w:tblPrEx>
         <w:tc>
           <w:tcPr>
             <w:tcW w:w="108" w:type="dxa"/>
@@ -5290,12 +4908,6 @@
         </w:tc>
       </w:tr>
       <w:tr>
-        <w:tblPrEx>
-          <w:tblCellMar>
-            <w:top w:w="0" w:type="dxa"/>
-            <w:bottom w:w="0" w:type="dxa"/>
-          </w:tblCellMar>
-        </w:tblPrEx>
         <w:tc>
           <w:tcPr>
             <w:tcW w:w="10264" w:type="dxa"/>
@@ -5319,12 +4931,6 @@
         </w:tc>
       </w:tr>
       <w:tr>
-        <w:tblPrEx>
-          <w:tblCellMar>
-            <w:top w:w="0" w:type="dxa"/>
-            <w:bottom w:w="0" w:type="dxa"/>
-          </w:tblCellMar>
-        </w:tblPrEx>
         <w:tc>
           <w:tcPr>
             <w:tcW w:w="108" w:type="dxa"/>
@@ -5391,12 +4997,6 @@
         </w:tc>
       </w:tr>
       <w:tr>
-        <w:tblPrEx>
-          <w:tblCellMar>
-            <w:top w:w="0" w:type="dxa"/>
-            <w:bottom w:w="0" w:type="dxa"/>
-          </w:tblCellMar>
-        </w:tblPrEx>
         <w:tc>
           <w:tcPr>
             <w:tcW w:w="10264" w:type="dxa"/>
@@ -5423,12 +5023,6 @@
         </w:tc>
       </w:tr>
       <w:tr>
-        <w:tblPrEx>
-          <w:tblCellMar>
-            <w:top w:w="0" w:type="dxa"/>
-            <w:bottom w:w="0" w:type="dxa"/>
-          </w:tblCellMar>
-        </w:tblPrEx>
         <w:tc>
           <w:tcPr>
             <w:tcW w:w="108" w:type="dxa"/>
@@ -5482,12 +5076,6 @@
         </w:tc>
       </w:tr>
       <w:tr>
-        <w:tblPrEx>
-          <w:tblCellMar>
-            <w:top w:w="0" w:type="dxa"/>
-            <w:bottom w:w="0" w:type="dxa"/>
-          </w:tblCellMar>
-        </w:tblPrEx>
         <w:tc>
           <w:tcPr>
             <w:tcW w:w="10264" w:type="dxa"/>
@@ -5511,12 +5099,6 @@
         </w:tc>
       </w:tr>
       <w:tr>
-        <w:tblPrEx>
-          <w:tblCellMar>
-            <w:top w:w="0" w:type="dxa"/>
-            <w:bottom w:w="0" w:type="dxa"/>
-          </w:tblCellMar>
-        </w:tblPrEx>
         <w:tc>
           <w:tcPr>
             <w:tcW w:w="10264" w:type="dxa"/>
@@ -5540,12 +5122,6 @@
         </w:tc>
       </w:tr>
       <w:tr>
-        <w:tblPrEx>
-          <w:tblCellMar>
-            <w:top w:w="0" w:type="dxa"/>
-            <w:bottom w:w="0" w:type="dxa"/>
-          </w:tblCellMar>
-        </w:tblPrEx>
         <w:tc>
           <w:tcPr>
             <w:tcW w:w="108" w:type="dxa"/>
@@ -5610,12 +5186,6 @@
         </w:tc>
       </w:tr>
       <w:tr>
-        <w:tblPrEx>
-          <w:tblCellMar>
-            <w:top w:w="0" w:type="dxa"/>
-            <w:bottom w:w="0" w:type="dxa"/>
-          </w:tblCellMar>
-        </w:tblPrEx>
         <w:trPr>
           <w:trHeight w:val="450"/>
         </w:trPr>
@@ -5656,12 +5226,6 @@
         </w:tc>
       </w:tr>
       <w:tr>
-        <w:tblPrEx>
-          <w:tblCellMar>
-            <w:top w:w="0" w:type="dxa"/>
-            <w:bottom w:w="0" w:type="dxa"/>
-          </w:tblCellMar>
-        </w:tblPrEx>
         <w:tc>
           <w:tcPr>
             <w:tcW w:w="108" w:type="dxa"/>
@@ -5793,9 +5357,8 @@
                 <w:sz w:val="16"/>
                 <w:szCs w:val="16"/>
               </w:rPr>
-              <w:t xml:space="preserve">(при </w:t>
-            </w:r>
-            <w:proofErr w:type="spellStart"/>
+              <w:t xml:space="preserve">(при испрашивании </w:t>
+            </w:r>
             <w:r>
               <w:rPr>
                 <w:i/>
@@ -5803,9 +5366,8 @@
                 <w:sz w:val="16"/>
                 <w:szCs w:val="16"/>
               </w:rPr>
-              <w:t>испрашивании</w:t>
-            </w:r>
-            <w:proofErr w:type="spellEnd"/>
+              <w:br/>
+            </w:r>
             <w:r>
               <w:rPr>
                 <w:i/>
@@ -5813,7 +5375,7 @@
                 <w:sz w:val="16"/>
                 <w:szCs w:val="16"/>
               </w:rPr>
-              <w:t xml:space="preserve"> </w:t>
+              <w:t xml:space="preserve">конвенционного </w:t>
             </w:r>
             <w:r>
               <w:rPr>
@@ -5831,36 +5393,12 @@
                 <w:sz w:val="16"/>
                 <w:szCs w:val="16"/>
               </w:rPr>
-              <w:t xml:space="preserve">конвенционного </w:t>
-            </w:r>
-            <w:r>
-              <w:rPr>
-                <w:i/>
-                <w:iCs/>
-                <w:sz w:val="16"/>
-                <w:szCs w:val="16"/>
-              </w:rPr>
-              <w:br/>
-            </w:r>
-            <w:r>
-              <w:rPr>
-                <w:i/>
-                <w:iCs/>
-                <w:sz w:val="16"/>
-                <w:szCs w:val="16"/>
-              </w:rPr>
               <w:t>приоритета)</w:t>
             </w:r>
           </w:p>
         </w:tc>
       </w:tr>
       <w:tr>
-        <w:tblPrEx>
-          <w:tblCellMar>
-            <w:top w:w="0" w:type="dxa"/>
-            <w:bottom w:w="0" w:type="dxa"/>
-          </w:tblCellMar>
-        </w:tblPrEx>
         <w:tc>
           <w:tcPr>
             <w:tcW w:w="108" w:type="dxa"/>
@@ -5966,12 +5504,6 @@
         </w:tc>
       </w:tr>
       <w:tr>
-        <w:tblPrEx>
-          <w:tblCellMar>
-            <w:top w:w="0" w:type="dxa"/>
-            <w:bottom w:w="0" w:type="dxa"/>
-          </w:tblCellMar>
-        </w:tblPrEx>
         <w:tc>
           <w:tcPr>
             <w:tcW w:w="108" w:type="dxa"/>
@@ -6089,12 +5621,6 @@
         </w:tc>
       </w:tr>
       <w:tr>
-        <w:tblPrEx>
-          <w:tblCellMar>
-            <w:top w:w="0" w:type="dxa"/>
-            <w:bottom w:w="0" w:type="dxa"/>
-          </w:tblCellMar>
-        </w:tblPrEx>
         <w:tc>
           <w:tcPr>
             <w:tcW w:w="108" w:type="dxa"/>
@@ -6195,12 +5721,6 @@
         </w:tc>
       </w:tr>
       <w:tr>
-        <w:tblPrEx>
-          <w:tblCellMar>
-            <w:top w:w="0" w:type="dxa"/>
-            <w:bottom w:w="0" w:type="dxa"/>
-          </w:tblCellMar>
-        </w:tblPrEx>
         <w:tc>
           <w:tcPr>
             <w:tcW w:w="108" w:type="dxa"/>
@@ -6318,12 +5838,6 @@
         </w:tc>
       </w:tr>
       <w:tr>
-        <w:tblPrEx>
-          <w:tblCellMar>
-            <w:top w:w="0" w:type="dxa"/>
-            <w:bottom w:w="0" w:type="dxa"/>
-          </w:tblCellMar>
-        </w:tblPrEx>
         <w:tc>
           <w:tcPr>
             <w:tcW w:w="108" w:type="dxa"/>
@@ -6424,12 +5938,6 @@
         </w:tc>
       </w:tr>
       <w:tr>
-        <w:tblPrEx>
-          <w:tblCellMar>
-            <w:top w:w="0" w:type="dxa"/>
-            <w:bottom w:w="0" w:type="dxa"/>
-          </w:tblCellMar>
-        </w:tblPrEx>
         <w:tc>
           <w:tcPr>
             <w:tcW w:w="108" w:type="dxa"/>
@@ -6547,12 +6055,6 @@
         </w:tc>
       </w:tr>
       <w:tr>
-        <w:tblPrEx>
-          <w:tblCellMar>
-            <w:top w:w="0" w:type="dxa"/>
-            <w:bottom w:w="0" w:type="dxa"/>
-          </w:tblCellMar>
-        </w:tblPrEx>
         <w:tc>
           <w:tcPr>
             <w:tcW w:w="5131" w:type="dxa"/>
@@ -6615,12 +6117,6 @@
         </w:tc>
       </w:tr>
       <w:tr>
-        <w:tblPrEx>
-          <w:tblCellMar>
-            <w:top w:w="0" w:type="dxa"/>
-            <w:bottom w:w="0" w:type="dxa"/>
-          </w:tblCellMar>
-        </w:tblPrEx>
         <w:tc>
           <w:tcPr>
             <w:tcW w:w="5131" w:type="dxa"/>
@@ -6683,12 +6179,6 @@
         </w:tc>
       </w:tr>
       <w:tr>
-        <w:tblPrEx>
-          <w:tblCellMar>
-            <w:top w:w="0" w:type="dxa"/>
-            <w:bottom w:w="0" w:type="dxa"/>
-          </w:tblCellMar>
-        </w:tblPrEx>
         <w:tc>
           <w:tcPr>
             <w:tcW w:w="5131" w:type="dxa"/>
@@ -6745,12 +6235,6 @@
         </w:tc>
       </w:tr>
       <w:tr>
-        <w:tblPrEx>
-          <w:tblCellMar>
-            <w:top w:w="0" w:type="dxa"/>
-            <w:bottom w:w="0" w:type="dxa"/>
-          </w:tblCellMar>
-        </w:tblPrEx>
         <w:tc>
           <w:tcPr>
             <w:tcW w:w="10264" w:type="dxa"/>
@@ -6774,12 +6258,6 @@
         </w:tc>
       </w:tr>
       <w:tr>
-        <w:tblPrEx>
-          <w:tblCellMar>
-            <w:top w:w="0" w:type="dxa"/>
-            <w:bottom w:w="0" w:type="dxa"/>
-          </w:tblCellMar>
-        </w:tblPrEx>
         <w:tc>
           <w:tcPr>
             <w:tcW w:w="108" w:type="dxa"/>
@@ -6844,12 +6322,6 @@
         </w:tc>
       </w:tr>
       <w:tr>
-        <w:tblPrEx>
-          <w:tblCellMar>
-            <w:top w:w="0" w:type="dxa"/>
-            <w:bottom w:w="0" w:type="dxa"/>
-          </w:tblCellMar>
-        </w:tblPrEx>
         <w:tc>
           <w:tcPr>
             <w:tcW w:w="10264" w:type="dxa"/>
@@ -6873,12 +6345,6 @@
         </w:tc>
       </w:tr>
       <w:tr>
-        <w:tblPrEx>
-          <w:tblCellMar>
-            <w:top w:w="0" w:type="dxa"/>
-            <w:bottom w:w="0" w:type="dxa"/>
-          </w:tblCellMar>
-        </w:tblPrEx>
         <w:tc>
           <w:tcPr>
             <w:tcW w:w="10264" w:type="dxa"/>
@@ -6902,12 +6368,6 @@
         </w:tc>
       </w:tr>
       <w:tr>
-        <w:tblPrEx>
-          <w:tblCellMar>
-            <w:top w:w="0" w:type="dxa"/>
-            <w:bottom w:w="0" w:type="dxa"/>
-          </w:tblCellMar>
-        </w:tblPrEx>
         <w:tc>
           <w:tcPr>
             <w:tcW w:w="108" w:type="dxa"/>
@@ -7140,12 +6600,6 @@
         </w:tc>
       </w:tr>
       <w:tr>
-        <w:tblPrEx>
-          <w:tblCellMar>
-            <w:top w:w="0" w:type="dxa"/>
-            <w:bottom w:w="0" w:type="dxa"/>
-          </w:tblCellMar>
-        </w:tblPrEx>
         <w:tc>
           <w:tcPr>
             <w:tcW w:w="10264" w:type="dxa"/>
@@ -7324,12 +6778,6 @@
         </w:tc>
       </w:tr>
       <w:tr>
-        <w:tblPrEx>
-          <w:tblCellMar>
-            <w:top w:w="0" w:type="dxa"/>
-            <w:bottom w:w="0" w:type="dxa"/>
-          </w:tblCellMar>
-        </w:tblPrEx>
         <w:tc>
           <w:tcPr>
             <w:tcW w:w="7392" w:type="dxa"/>
@@ -7409,12 +6857,6 @@
         </w:tc>
       </w:tr>
       <w:tr>
-        <w:tblPrEx>
-          <w:tblCellMar>
-            <w:top w:w="0" w:type="dxa"/>
-            <w:bottom w:w="0" w:type="dxa"/>
-          </w:tblCellMar>
-        </w:tblPrEx>
         <w:tc>
           <w:tcPr>
             <w:tcW w:w="7392" w:type="dxa"/>
@@ -7478,12 +6920,6 @@
         </w:tc>
       </w:tr>
       <w:tr>
-        <w:tblPrEx>
-          <w:tblCellMar>
-            <w:top w:w="0" w:type="dxa"/>
-            <w:bottom w:w="0" w:type="dxa"/>
-          </w:tblCellMar>
-        </w:tblPrEx>
         <w:tc>
           <w:tcPr>
             <w:tcW w:w="108" w:type="dxa"/>
@@ -7616,12 +7052,6 @@
         </w:tc>
       </w:tr>
       <w:tr>
-        <w:tblPrEx>
-          <w:tblCellMar>
-            <w:top w:w="0" w:type="dxa"/>
-            <w:bottom w:w="0" w:type="dxa"/>
-          </w:tblCellMar>
-        </w:tblPrEx>
         <w:tc>
           <w:tcPr>
             <w:tcW w:w="7392" w:type="dxa"/>
@@ -7677,12 +7107,6 @@
         </w:tc>
       </w:tr>
       <w:tr>
-        <w:tblPrEx>
-          <w:tblCellMar>
-            <w:top w:w="0" w:type="dxa"/>
-            <w:bottom w:w="0" w:type="dxa"/>
-          </w:tblCellMar>
-        </w:tblPrEx>
         <w:tc>
           <w:tcPr>
             <w:tcW w:w="7392" w:type="dxa"/>
@@ -7746,12 +7170,6 @@
         </w:tc>
       </w:tr>
       <w:tr>
-        <w:tblPrEx>
-          <w:tblCellMar>
-            <w:top w:w="0" w:type="dxa"/>
-            <w:bottom w:w="0" w:type="dxa"/>
-          </w:tblCellMar>
-        </w:tblPrEx>
         <w:tc>
           <w:tcPr>
             <w:tcW w:w="108" w:type="dxa"/>
@@ -7842,12 +7260,6 @@
         </w:tc>
       </w:tr>
       <w:tr>
-        <w:tblPrEx>
-          <w:tblCellMar>
-            <w:top w:w="0" w:type="dxa"/>
-            <w:bottom w:w="0" w:type="dxa"/>
-          </w:tblCellMar>
-        </w:tblPrEx>
         <w:tc>
           <w:tcPr>
             <w:tcW w:w="7392" w:type="dxa"/>
@@ -7911,12 +7323,6 @@
         </w:tc>
       </w:tr>
       <w:tr>
-        <w:tblPrEx>
-          <w:tblCellMar>
-            <w:top w:w="0" w:type="dxa"/>
-            <w:bottom w:w="0" w:type="dxa"/>
-          </w:tblCellMar>
-        </w:tblPrEx>
         <w:tc>
           <w:tcPr>
             <w:tcW w:w="7392" w:type="dxa"/>
@@ -7980,12 +7386,6 @@
         </w:tc>
       </w:tr>
       <w:tr>
-        <w:tblPrEx>
-          <w:tblCellMar>
-            <w:top w:w="0" w:type="dxa"/>
-            <w:bottom w:w="0" w:type="dxa"/>
-          </w:tblCellMar>
-        </w:tblPrEx>
         <w:tc>
           <w:tcPr>
             <w:tcW w:w="108" w:type="dxa"/>
@@ -8076,12 +7476,6 @@
         </w:tc>
       </w:tr>
       <w:tr>
-        <w:tblPrEx>
-          <w:tblCellMar>
-            <w:top w:w="0" w:type="dxa"/>
-            <w:bottom w:w="0" w:type="dxa"/>
-          </w:tblCellMar>
-        </w:tblPrEx>
         <w:tc>
           <w:tcPr>
             <w:tcW w:w="7392" w:type="dxa"/>
@@ -8145,12 +7539,6 @@
         </w:tc>
       </w:tr>
       <w:tr>
-        <w:tblPrEx>
-          <w:tblCellMar>
-            <w:top w:w="0" w:type="dxa"/>
-            <w:bottom w:w="0" w:type="dxa"/>
-          </w:tblCellMar>
-        </w:tblPrEx>
         <w:tc>
           <w:tcPr>
             <w:tcW w:w="7392" w:type="dxa"/>
@@ -8214,12 +7602,6 @@
         </w:tc>
       </w:tr>
       <w:tr>
-        <w:tblPrEx>
-          <w:tblCellMar>
-            <w:top w:w="0" w:type="dxa"/>
-            <w:bottom w:w="0" w:type="dxa"/>
-          </w:tblCellMar>
-        </w:tblPrEx>
         <w:tc>
           <w:tcPr>
             <w:tcW w:w="108" w:type="dxa"/>
@@ -8319,12 +7701,6 @@
         </w:tc>
       </w:tr>
       <w:tr>
-        <w:tblPrEx>
-          <w:tblCellMar>
-            <w:top w:w="0" w:type="dxa"/>
-            <w:bottom w:w="0" w:type="dxa"/>
-          </w:tblCellMar>
-        </w:tblPrEx>
         <w:tc>
           <w:tcPr>
             <w:tcW w:w="7392" w:type="dxa"/>
@@ -8407,12 +7783,6 @@
         </w:tc>
       </w:tr>
       <w:tr>
-        <w:tblPrEx>
-          <w:tblCellMar>
-            <w:top w:w="0" w:type="dxa"/>
-            <w:bottom w:w="0" w:type="dxa"/>
-          </w:tblCellMar>
-        </w:tblPrEx>
         <w:tc>
           <w:tcPr>
             <w:tcW w:w="7392" w:type="dxa"/>
@@ -8476,12 +7846,6 @@
         </w:tc>
       </w:tr>
       <w:tr>
-        <w:tblPrEx>
-          <w:tblCellMar>
-            <w:top w:w="0" w:type="dxa"/>
-            <w:bottom w:w="0" w:type="dxa"/>
-          </w:tblCellMar>
-        </w:tblPrEx>
         <w:tc>
           <w:tcPr>
             <w:tcW w:w="108" w:type="dxa"/>
@@ -8572,12 +7936,6 @@
         </w:tc>
       </w:tr>
       <w:tr>
-        <w:tblPrEx>
-          <w:tblCellMar>
-            <w:top w:w="0" w:type="dxa"/>
-            <w:bottom w:w="0" w:type="dxa"/>
-          </w:tblCellMar>
-        </w:tblPrEx>
         <w:tc>
           <w:tcPr>
             <w:tcW w:w="7392" w:type="dxa"/>
@@ -8641,12 +7999,6 @@
         </w:tc>
       </w:tr>
       <w:tr>
-        <w:tblPrEx>
-          <w:tblCellMar>
-            <w:top w:w="0" w:type="dxa"/>
-            <w:bottom w:w="0" w:type="dxa"/>
-          </w:tblCellMar>
-        </w:tblPrEx>
         <w:tc>
           <w:tcPr>
             <w:tcW w:w="7392" w:type="dxa"/>
@@ -8710,12 +8062,6 @@
         </w:tc>
       </w:tr>
       <w:tr>
-        <w:tblPrEx>
-          <w:tblCellMar>
-            <w:top w:w="0" w:type="dxa"/>
-            <w:bottom w:w="0" w:type="dxa"/>
-          </w:tblCellMar>
-        </w:tblPrEx>
         <w:tc>
           <w:tcPr>
             <w:tcW w:w="108" w:type="dxa"/>
@@ -8806,12 +8152,6 @@
         </w:tc>
       </w:tr>
       <w:tr>
-        <w:tblPrEx>
-          <w:tblCellMar>
-            <w:top w:w="0" w:type="dxa"/>
-            <w:bottom w:w="0" w:type="dxa"/>
-          </w:tblCellMar>
-        </w:tblPrEx>
         <w:tc>
           <w:tcPr>
             <w:tcW w:w="7392" w:type="dxa"/>
@@ -8875,12 +8215,6 @@
         </w:tc>
       </w:tr>
       <w:tr>
-        <w:tblPrEx>
-          <w:tblCellMar>
-            <w:top w:w="0" w:type="dxa"/>
-            <w:bottom w:w="0" w:type="dxa"/>
-          </w:tblCellMar>
-        </w:tblPrEx>
         <w:tc>
           <w:tcPr>
             <w:tcW w:w="10264" w:type="dxa"/>
@@ -8903,12 +8237,6 @@
         </w:tc>
       </w:tr>
       <w:tr>
-        <w:tblPrEx>
-          <w:tblCellMar>
-            <w:top w:w="0" w:type="dxa"/>
-            <w:bottom w:w="0" w:type="dxa"/>
-          </w:tblCellMar>
-        </w:tblPrEx>
         <w:tc>
           <w:tcPr>
             <w:tcW w:w="2709" w:type="dxa"/>
@@ -8977,12 +8305,6 @@
         </w:tc>
       </w:tr>
       <w:tr>
-        <w:tblPrEx>
-          <w:tblCellMar>
-            <w:top w:w="0" w:type="dxa"/>
-            <w:bottom w:w="0" w:type="dxa"/>
-          </w:tblCellMar>
-        </w:tblPrEx>
         <w:tc>
           <w:tcPr>
             <w:tcW w:w="10264" w:type="dxa"/>
@@ -9006,12 +8328,6 @@
         </w:tc>
       </w:tr>
       <w:tr>
-        <w:tblPrEx>
-          <w:tblCellMar>
-            <w:top w:w="0" w:type="dxa"/>
-            <w:bottom w:w="0" w:type="dxa"/>
-          </w:tblCellMar>
-        </w:tblPrEx>
         <w:tc>
           <w:tcPr>
             <w:tcW w:w="108" w:type="dxa"/>
@@ -9067,12 +8383,6 @@
         </w:tc>
       </w:tr>
       <w:tr>
-        <w:tblPrEx>
-          <w:tblCellMar>
-            <w:top w:w="0" w:type="dxa"/>
-            <w:bottom w:w="0" w:type="dxa"/>
-          </w:tblCellMar>
-        </w:tblPrEx>
         <w:tc>
           <w:tcPr>
             <w:tcW w:w="10264" w:type="dxa"/>
@@ -9096,12 +8406,6 @@
         </w:tc>
       </w:tr>
       <w:tr>
-        <w:tblPrEx>
-          <w:tblCellMar>
-            <w:top w:w="0" w:type="dxa"/>
-            <w:bottom w:w="0" w:type="dxa"/>
-          </w:tblCellMar>
-        </w:tblPrEx>
         <w:tc>
           <w:tcPr>
             <w:tcW w:w="108" w:type="dxa"/>
@@ -9155,12 +8459,6 @@
         </w:tc>
       </w:tr>
       <w:tr>
-        <w:tblPrEx>
-          <w:tblCellMar>
-            <w:top w:w="0" w:type="dxa"/>
-            <w:bottom w:w="0" w:type="dxa"/>
-          </w:tblCellMar>
-        </w:tblPrEx>
         <w:tc>
           <w:tcPr>
             <w:tcW w:w="10264" w:type="dxa"/>
@@ -9184,12 +8482,6 @@
         </w:tc>
       </w:tr>
       <w:tr>
-        <w:tblPrEx>
-          <w:tblCellMar>
-            <w:top w:w="0" w:type="dxa"/>
-            <w:bottom w:w="0" w:type="dxa"/>
-          </w:tblCellMar>
-        </w:tblPrEx>
         <w:tc>
           <w:tcPr>
             <w:tcW w:w="10264" w:type="dxa"/>
@@ -9375,23 +8667,40 @@
               <w:keepNext/>
               <w:ind w:left="85" w:right="85" w:firstLine="482"/>
               <w:jc w:val="both"/>
-            </w:pPr>
-            <w:r>
               <w:rPr>
                 <w:spacing w:val="-2"/>
               </w:rPr>
+            </w:pPr>
+            <w:r>
+              <w:rPr>
+                <w:spacing w:val="-2"/>
+              </w:rPr>
               <w:t>Заявитель подтверждает достоверность информации, приведенной в настоящей заявке.</w:t>
             </w:r>
           </w:p>
-        </w:tc>
-      </w:tr>
-      <w:tr>
-        <w:tblPrEx>
-          <w:tblCellMar>
-            <w:top w:w="0" w:type="dxa"/>
-            <w:bottom w:w="0" w:type="dxa"/>
-          </w:tblCellMar>
-        </w:tblPrEx>
+          <w:p>
+            <w:pPr>
+              <w:keepNext/>
+              <w:ind w:left="85" w:right="85" w:firstLine="482"/>
+              <w:jc w:val="both"/>
+            </w:pPr>
+            <w:r>
+              <w:t>Заявитель подтверждает свое намерение использовать заявляемое обозначение в качестве товарного знака (знака обслуживания) в отношении всех товаров и (или) услуг, для индивидуализации которых такой товарный знак (знак обслуживания) будет зарегистрирован в Государственном реестре товарных знаков и знаков обслуживания Российской Федерации.</w:t>
+            </w:r>
+          </w:p>
+          <w:p>
+            <w:pPr>
+              <w:keepNext/>
+              <w:ind w:left="85" w:right="85" w:firstLine="482"/>
+              <w:jc w:val="both"/>
+            </w:pPr>
+            <w:r>
+              <w:t>Заявителю известно, что в случае неиспользования товарного знака непрерывно в течение трех лет правовая охрана такого товарного знака может быть прекращена досрочно в отношении всех товаров или части товаров, для индивидуализации которых товарный знак зарегистрирован, на основании пункта 1 статьи 1486 Кодекса.</w:t>
+            </w:r>
+          </w:p>
+        </w:tc>
+      </w:tr>
+      <w:tr>
         <w:tc>
           <w:tcPr>
             <w:tcW w:w="10264" w:type="dxa"/>
@@ -9414,12 +8723,6 @@
         </w:tc>
       </w:tr>
       <w:tr>
-        <w:tblPrEx>
-          <w:tblCellMar>
-            <w:top w:w="0" w:type="dxa"/>
-            <w:bottom w:w="0" w:type="dxa"/>
-          </w:tblCellMar>
-        </w:tblPrEx>
         <w:trPr>
           <w:trHeight w:val="952"/>
         </w:trPr>
@@ -9442,12 +8745,6 @@
         </w:tc>
       </w:tr>
       <w:tr>
-        <w:tblPrEx>
-          <w:tblCellMar>
-            <w:top w:w="0" w:type="dxa"/>
-            <w:bottom w:w="0" w:type="dxa"/>
-          </w:tblCellMar>
-        </w:tblPrEx>
         <w:tc>
           <w:tcPr>
             <w:tcW w:w="10264" w:type="dxa"/>
@@ -9621,7 +8918,7 @@
 </file>
 
 <file path=word/endnotes.xml><?xml version="1.0" encoding="utf-8"?>
-<w:endnotes xmlns:wpc="http://schemas.microsoft.com/office/word/2010/wordprocessingCanvas" xmlns:cx="http://schemas.microsoft.com/office/drawing/2014/chartex" xmlns:cx1="http://schemas.microsoft.com/office/drawing/2015/9/8/chartex" xmlns:cx2="http://schemas.microsoft.com/office/drawing/2015/10/21/chartex" xmlns:cx3="http://schemas.microsoft.com/office/drawing/2016/5/9/chartex" xmlns:cx4="http://schemas.microsoft.com/office/drawing/2016/5/10/chartex" xmlns:cx5="http://schemas.microsoft.com/office/drawing/2016/5/11/chartex" xmlns:cx6="http://schemas.microsoft.com/office/drawing/2016/5/12/chartex" xmlns:cx7="http://schemas.microsoft.com/office/drawing/2016/5/13/chartex" xmlns:cx8="http://schemas.microsoft.com/office/drawing/2016/5/14/chartex" xmlns:mc="http://schemas.openxmlformats.org/markup-compatibility/2006" xmlns:aink="http://schemas.microsoft.com/office/drawing/2016/ink" xmlns:am3d="http://schemas.microsoft.com/office/drawing/2017/model3d" xmlns:o="urn:schemas-microsoft-com:office:office" xmlns:oel="http://schemas.microsoft.com/office/2019/extlst" xmlns:r="http://schemas.openxmlformats.org/officeDocument/2006/relationships" xmlns:m="http://schemas.openxmlformats.org/officeDocument/2006/math" xmlns:v="urn:schemas-microsoft-com:vml" xmlns:wp14="http://schemas.microsoft.com/office/word/2010/wordprocessingDrawing" xmlns:wp="http://schemas.openxmlformats.org/drawingml/2006/wordprocessingDrawing" xmlns:w10="urn:schemas-microsoft-com:office:word" xmlns:w="http://schemas.openxmlformats.org/wordprocessingml/2006/main" xmlns:w14="http://schemas.microsoft.com/office/word/2010/wordml" xmlns:w15="http://schemas.microsoft.com/office/word/2012/wordml" xmlns:w16cex="http://schemas.microsoft.com/office/word/2018/wordml/cex" xmlns:w16cid="http://schemas.microsoft.com/office/word/2016/wordml/cid" xmlns:w16="http://schemas.microsoft.com/office/word/2018/wordml" xmlns:w16sdtdh="http://schemas.microsoft.com/office/word/2020/wordml/sdtdatahash" xmlns:w16se="http://schemas.microsoft.com/office/word/2015/wordml/symex" xmlns:wpg="http://schemas.microsoft.com/office/word/2010/wordprocessingGroup" xmlns:wpi="http://schemas.microsoft.com/office/word/2010/wordprocessingInk" xmlns:wne="http://schemas.microsoft.com/office/word/2006/wordml" xmlns:wps="http://schemas.microsoft.com/office/word/2010/wordprocessingShape" mc:Ignorable="w14 w15 w16se w16cid w16 w16cex w16sdtdh wp14">
+<w:endnotes xmlns:wpc="http://schemas.microsoft.com/office/word/2010/wordprocessingCanvas" xmlns:cx="http://schemas.microsoft.com/office/drawing/2014/chartex" xmlns:cx1="http://schemas.microsoft.com/office/drawing/2015/9/8/chartex" xmlns:cx2="http://schemas.microsoft.com/office/drawing/2015/10/21/chartex" xmlns:cx3="http://schemas.microsoft.com/office/drawing/2016/5/9/chartex" xmlns:cx4="http://schemas.microsoft.com/office/drawing/2016/5/10/chartex" xmlns:cx5="http://schemas.microsoft.com/office/drawing/2016/5/11/chartex" xmlns:cx6="http://schemas.microsoft.com/office/drawing/2016/5/12/chartex" xmlns:cx7="http://schemas.microsoft.com/office/drawing/2016/5/13/chartex" xmlns:cx8="http://schemas.microsoft.com/office/drawing/2016/5/14/chartex" xmlns:mc="http://schemas.openxmlformats.org/markup-compatibility/2006" xmlns:aink="http://schemas.microsoft.com/office/drawing/2016/ink" xmlns:am3d="http://schemas.microsoft.com/office/drawing/2017/model3d" xmlns:o="urn:schemas-microsoft-com:office:office" xmlns:oel="http://schemas.microsoft.com/office/2019/extlst" xmlns:r="http://schemas.openxmlformats.org/officeDocument/2006/relationships" xmlns:m="http://schemas.openxmlformats.org/officeDocument/2006/math" xmlns:v="urn:schemas-microsoft-com:vml" xmlns:wp14="http://schemas.microsoft.com/office/word/2010/wordprocessingDrawing" xmlns:wp="http://schemas.openxmlformats.org/drawingml/2006/wordprocessingDrawing" xmlns:w10="urn:schemas-microsoft-com:office:word" xmlns:w="http://schemas.openxmlformats.org/wordprocessingml/2006/main" xmlns:w14="http://schemas.microsoft.com/office/word/2010/wordml" xmlns:w15="http://schemas.microsoft.com/office/word/2012/wordml" xmlns:w16cex="http://schemas.microsoft.com/office/word/2018/wordml/cex" xmlns:w16cid="http://schemas.microsoft.com/office/word/2016/wordml/cid" xmlns:w16="http://schemas.microsoft.com/office/word/2018/wordml" xmlns:w16du="http://schemas.microsoft.com/office/word/2023/wordml/word16du" xmlns:w16sdtdh="http://schemas.microsoft.com/office/word/2020/wordml/sdtdatahash" xmlns:w16sdtfl="http://schemas.microsoft.com/office/word/2024/wordml/sdtformatlock" xmlns:w16se="http://schemas.microsoft.com/office/word/2015/wordml/symex" xmlns:wpg="http://schemas.microsoft.com/office/word/2010/wordprocessingGroup" xmlns:wpi="http://schemas.microsoft.com/office/word/2010/wordprocessingInk" xmlns:wne="http://schemas.microsoft.com/office/word/2006/wordml" xmlns:wps="http://schemas.microsoft.com/office/word/2010/wordprocessingShape" mc:Ignorable="w14 w15 w16se w16cid w16 w16cex w16sdtdh w16sdtfl w16du wp14">
   <w:endnote w:type="separator" w:id="-1">
     <w:p>
       <w:r>
@@ -9640,7 +8937,7 @@
 </file>
 
 <file path=word/footnotes.xml><?xml version="1.0" encoding="utf-8"?>
-<w:footnotes xmlns:wpc="http://schemas.microsoft.com/office/word/2010/wordprocessingCanvas" xmlns:cx="http://schemas.microsoft.com/office/drawing/2014/chartex" xmlns:cx1="http://schemas.microsoft.com/office/drawing/2015/9/8/chartex" xmlns:cx2="http://schemas.microsoft.com/office/drawing/2015/10/21/chartex" xmlns:cx3="http://schemas.microsoft.com/office/drawing/2016/5/9/chartex" xmlns:cx4="http://schemas.microsoft.com/office/drawing/2016/5/10/chartex" xmlns:cx5="http://schemas.microsoft.com/office/drawing/2016/5/11/chartex" xmlns:cx6="http://schemas.microsoft.com/office/drawing/2016/5/12/chartex" xmlns:cx7="http://schemas.microsoft.com/office/drawing/2016/5/13/chartex" xmlns:cx8="http://schemas.microsoft.com/office/drawing/2016/5/14/chartex" xmlns:mc="http://schemas.openxmlformats.org/markup-compatibility/2006" xmlns:aink="http://schemas.microsoft.com/office/drawing/2016/ink" xmlns:am3d="http://schemas.microsoft.com/office/drawing/2017/model3d" xmlns:o="urn:schemas-microsoft-com:office:office" xmlns:oel="http://schemas.microsoft.com/office/2019/extlst" xmlns:r="http://schemas.openxmlformats.org/officeDocument/2006/relationships" xmlns:m="http://schemas.openxmlformats.org/officeDocument/2006/math" xmlns:v="urn:schemas-microsoft-com:vml" xmlns:wp14="http://schemas.microsoft.com/office/word/2010/wordprocessingDrawing" xmlns:wp="http://schemas.openxmlformats.org/drawingml/2006/wordprocessingDrawing" xmlns:w10="urn:schemas-microsoft-com:office:word" xmlns:w="http://schemas.openxmlformats.org/wordprocessingml/2006/main" xmlns:w14="http://schemas.microsoft.com/office/word/2010/wordml" xmlns:w15="http://schemas.microsoft.com/office/word/2012/wordml" xmlns:w16cex="http://schemas.microsoft.com/office/word/2018/wordml/cex" xmlns:w16cid="http://schemas.microsoft.com/office/word/2016/wordml/cid" xmlns:w16="http://schemas.microsoft.com/office/word/2018/wordml" xmlns:w16sdtdh="http://schemas.microsoft.com/office/word/2020/wordml/sdtdatahash" xmlns:w16se="http://schemas.microsoft.com/office/word/2015/wordml/symex" xmlns:wpg="http://schemas.microsoft.com/office/word/2010/wordprocessingGroup" xmlns:wpi="http://schemas.microsoft.com/office/word/2010/wordprocessingInk" xmlns:wne="http://schemas.microsoft.com/office/word/2006/wordml" xmlns:wps="http://schemas.microsoft.com/office/word/2010/wordprocessingShape" mc:Ignorable="w14 w15 w16se w16cid w16 w16cex w16sdtdh wp14">
+<w:footnotes xmlns:wpc="http://schemas.microsoft.com/office/word/2010/wordprocessingCanvas" xmlns:cx="http://schemas.microsoft.com/office/drawing/2014/chartex" xmlns:cx1="http://schemas.microsoft.com/office/drawing/2015/9/8/chartex" xmlns:cx2="http://schemas.microsoft.com/office/drawing/2015/10/21/chartex" xmlns:cx3="http://schemas.microsoft.com/office/drawing/2016/5/9/chartex" xmlns:cx4="http://schemas.microsoft.com/office/drawing/2016/5/10/chartex" xmlns:cx5="http://schemas.microsoft.com/office/drawing/2016/5/11/chartex" xmlns:cx6="http://schemas.microsoft.com/office/drawing/2016/5/12/chartex" xmlns:cx7="http://schemas.microsoft.com/office/drawing/2016/5/13/chartex" xmlns:cx8="http://schemas.microsoft.com/office/drawing/2016/5/14/chartex" xmlns:mc="http://schemas.openxmlformats.org/markup-compatibility/2006" xmlns:aink="http://schemas.microsoft.com/office/drawing/2016/ink" xmlns:am3d="http://schemas.microsoft.com/office/drawing/2017/model3d" xmlns:o="urn:schemas-microsoft-com:office:office" xmlns:oel="http://schemas.microsoft.com/office/2019/extlst" xmlns:r="http://schemas.openxmlformats.org/officeDocument/2006/relationships" xmlns:m="http://schemas.openxmlformats.org/officeDocument/2006/math" xmlns:v="urn:schemas-microsoft-com:vml" xmlns:wp14="http://schemas.microsoft.com/office/word/2010/wordprocessingDrawing" xmlns:wp="http://schemas.openxmlformats.org/drawingml/2006/wordprocessingDrawing" xmlns:w10="urn:schemas-microsoft-com:office:word" xmlns:w="http://schemas.openxmlformats.org/wordprocessingml/2006/main" xmlns:w14="http://schemas.microsoft.com/office/word/2010/wordml" xmlns:w15="http://schemas.microsoft.com/office/word/2012/wordml" xmlns:w16cex="http://schemas.microsoft.com/office/word/2018/wordml/cex" xmlns:w16cid="http://schemas.microsoft.com/office/word/2016/wordml/cid" xmlns:w16="http://schemas.microsoft.com/office/word/2018/wordml" xmlns:w16du="http://schemas.microsoft.com/office/word/2023/wordml/word16du" xmlns:w16sdtdh="http://schemas.microsoft.com/office/word/2020/wordml/sdtdatahash" xmlns:w16sdtfl="http://schemas.microsoft.com/office/word/2024/wordml/sdtformatlock" xmlns:w16se="http://schemas.microsoft.com/office/word/2015/wordml/symex" xmlns:wpg="http://schemas.microsoft.com/office/word/2010/wordprocessingGroup" xmlns:wpi="http://schemas.microsoft.com/office/word/2010/wordprocessingInk" xmlns:wne="http://schemas.microsoft.com/office/word/2006/wordml" xmlns:wps="http://schemas.microsoft.com/office/word/2010/wordprocessingShape" mc:Ignorable="w14 w15 w16se w16cid w16 w16cex w16sdtdh w16sdtfl w16du wp14">
   <w:footnote w:type="separator" w:id="-1">
     <w:p>
       <w:r>
@@ -9659,7 +8956,7 @@
 </file>
 
 <file path=word/styles.xml><?xml version="1.0" encoding="utf-8"?>
-<w:styles xmlns:mc="http://schemas.openxmlformats.org/markup-compatibility/2006" xmlns:r="http://schemas.openxmlformats.org/officeDocument/2006/relationships" xmlns:w="http://schemas.openxmlformats.org/wordprocessingml/2006/main" xmlns:w14="http://schemas.microsoft.com/office/word/2010/wordml" xmlns:w15="http://schemas.microsoft.com/office/word/2012/wordml" xmlns:w16cex="http://schemas.microsoft.com/office/word/2018/wordml/cex" xmlns:w16cid="http://schemas.microsoft.com/office/word/2016/wordml/cid" xmlns:w16="http://schemas.microsoft.com/office/word/2018/wordml" xmlns:w16sdtdh="http://schemas.microsoft.com/office/word/2020/wordml/sdtdatahash" xmlns:w16se="http://schemas.microsoft.com/office/word/2015/wordml/symex" mc:Ignorable="w14 w15 w16se w16cid w16 w16cex w16sdtdh">
+<w:styles xmlns:mc="http://schemas.openxmlformats.org/markup-compatibility/2006" xmlns:r="http://schemas.openxmlformats.org/officeDocument/2006/relationships" xmlns:w="http://schemas.openxmlformats.org/wordprocessingml/2006/main" xmlns:w14="http://schemas.microsoft.com/office/word/2010/wordml" xmlns:w15="http://schemas.microsoft.com/office/word/2012/wordml" xmlns:w16cex="http://schemas.microsoft.com/office/word/2018/wordml/cex" xmlns:w16cid="http://schemas.microsoft.com/office/word/2016/wordml/cid" xmlns:w16="http://schemas.microsoft.com/office/word/2018/wordml" xmlns:w16du="http://schemas.microsoft.com/office/word/2023/wordml/word16du" xmlns:w16sdtdh="http://schemas.microsoft.com/office/word/2020/wordml/sdtdatahash" xmlns:w16sdtfl="http://schemas.microsoft.com/office/word/2024/wordml/sdtformatlock" xmlns:w16se="http://schemas.microsoft.com/office/word/2015/wordml/symex" mc:Ignorable="w14 w15 w16se w16cid w16 w16cex w16sdtdh w16sdtfl w16du">
   <w:docDefaults>
     <w:rPrDefault>
       <w:rPr>
@@ -10071,8 +9368,9 @@
   </w:style>
   <w:style w:type="character" w:default="1" w:styleId="a0">
     <w:name w:val="Default Paragraph Font"/>
-    <w:uiPriority w:val="99"/>
+    <w:uiPriority w:val="1"/>
     <w:semiHidden/>
+    <w:unhideWhenUsed/>
   </w:style>
   <w:style w:type="table" w:default="1" w:styleId="a1">
     <w:name w:val="Normal Table"/>

</xml_diff>